<commit_message>
Monte Tejas: solicitud con el representante, el CIF y los documentos del acuse de 2025
Del acuse de recibo del registro electrónico de 2025 (2025-E-RE-1230):
representante Jonatan Corona Miguel, CIF del club G39861828 y los
documentos que se presentaron entonces (plan de autoprotección y
certificados de revisión de la carpa y del arco), que pasan a la lista de
documentación aportada.

Co-Authored-By: Claude Fable 5.1 <noreply@anthropic.com>
Claude-Session: https://claude.ai/code/session_01J4uHgVoxQeg9dhrMXcFRst
</commit_message>
<xml_diff>
--- a/docs/eventos/tramites/solicitud-ley-3-2017-monte-tejas-2026.docx
+++ b/docs/eventos/tramites/solicitud-ley-3-2017-monte-tejas-2026.docx
@@ -117,6 +117,221 @@
             <w:r>
               <w:rPr>
                 <w:rFonts w:ascii="Arial" w:cs="Arial" w:eastAsia="Arial" w:hAnsi="Arial"/>
+                <w:b w:val="false"/>
+                <w:bCs w:val="false"/>
+                <w:i w:val="false"/>
+                <w:iCs w:val="false"/>
+                <w:sz w:val="18"/>
+                <w:szCs w:val="18"/>
+              </w:rPr>
+              <w:t xml:space="preserve">Jonatan</w:t>
+            </w:r>
+          </w:p>
+        </w:tc>
+        <w:tc>
+          <w:tcPr>
+            <w:tcW w:type="dxa" w:w="1500"/>
+            <w:tcBorders>
+              <w:top w:val="single" w:color="555555" w:sz="6"/>
+              <w:left w:val="single" w:color="555555" w:sz="6"/>
+              <w:bottom w:val="single" w:color="555555" w:sz="6"/>
+              <w:right w:val="single" w:color="555555" w:sz="6"/>
+            </w:tcBorders>
+            <w:shd w:fill="E8EEEA" w:color="auto" w:val="clear"/>
+            <w:tcMar>
+              <w:top w:type="dxa" w:w="40"/>
+              <w:left w:type="dxa" w:w="80"/>
+              <w:bottom w:type="dxa" w:w="40"/>
+              <w:right w:type="dxa" w:w="80"/>
+            </w:tcMar>
+            <w:vAlign w:val="center"/>
+          </w:tcPr>
+          <w:p>
+            <w:pPr>
+              <w:spacing w:after="60" w:before="60" w:line="260"/>
+            </w:pPr>
+            <w:r>
+              <w:rPr>
+                <w:rFonts w:ascii="Arial" w:cs="Arial" w:eastAsia="Arial" w:hAnsi="Arial"/>
+                <w:b/>
+                <w:bCs/>
+                <w:i w:val="false"/>
+                <w:iCs w:val="false"/>
+                <w:sz w:val="18"/>
+                <w:szCs w:val="18"/>
+              </w:rPr>
+              <w:t xml:space="preserve">APELLIDOS</w:t>
+            </w:r>
+          </w:p>
+        </w:tc>
+        <w:tc>
+          <w:tcPr>
+            <w:tcW w:type="dxa" w:w="3319"/>
+            <w:tcBorders>
+              <w:top w:val="single" w:color="555555" w:sz="6"/>
+              <w:left w:val="single" w:color="555555" w:sz="6"/>
+              <w:bottom w:val="single" w:color="555555" w:sz="6"/>
+              <w:right w:val="single" w:color="555555" w:sz="6"/>
+            </w:tcBorders>
+            <w:tcMar>
+              <w:top w:type="dxa" w:w="40"/>
+              <w:left w:type="dxa" w:w="80"/>
+              <w:bottom w:type="dxa" w:w="40"/>
+              <w:right w:type="dxa" w:w="80"/>
+            </w:tcMar>
+            <w:vAlign w:val="center"/>
+          </w:tcPr>
+          <w:p>
+            <w:pPr>
+              <w:spacing w:after="60" w:before="60" w:line="260"/>
+            </w:pPr>
+            <w:r>
+              <w:rPr>
+                <w:rFonts w:ascii="Arial" w:cs="Arial" w:eastAsia="Arial" w:hAnsi="Arial"/>
+                <w:b w:val="false"/>
+                <w:bCs w:val="false"/>
+                <w:i w:val="false"/>
+                <w:iCs w:val="false"/>
+                <w:sz w:val="18"/>
+                <w:szCs w:val="18"/>
+              </w:rPr>
+              <w:t xml:space="preserve">Corona Miguel</w:t>
+            </w:r>
+          </w:p>
+        </w:tc>
+      </w:tr>
+      <w:tr>
+        <w:tc>
+          <w:tcPr>
+            <w:tcW w:type="dxa" w:w="1500"/>
+            <w:tcBorders>
+              <w:top w:val="single" w:color="555555" w:sz="6"/>
+              <w:left w:val="single" w:color="555555" w:sz="6"/>
+              <w:bottom w:val="single" w:color="555555" w:sz="6"/>
+              <w:right w:val="single" w:color="555555" w:sz="6"/>
+            </w:tcBorders>
+            <w:shd w:fill="E8EEEA" w:color="auto" w:val="clear"/>
+            <w:tcMar>
+              <w:top w:type="dxa" w:w="40"/>
+              <w:left w:type="dxa" w:w="80"/>
+              <w:bottom w:type="dxa" w:w="40"/>
+              <w:right w:type="dxa" w:w="80"/>
+            </w:tcMar>
+            <w:vAlign w:val="center"/>
+          </w:tcPr>
+          <w:p>
+            <w:pPr>
+              <w:spacing w:after="60" w:before="60" w:line="260"/>
+            </w:pPr>
+            <w:r>
+              <w:rPr>
+                <w:rFonts w:ascii="Arial" w:cs="Arial" w:eastAsia="Arial" w:hAnsi="Arial"/>
+                <w:b/>
+                <w:bCs/>
+                <w:i w:val="false"/>
+                <w:iCs w:val="false"/>
+                <w:sz w:val="18"/>
+                <w:szCs w:val="18"/>
+              </w:rPr>
+              <w:t xml:space="preserve">DNI</w:t>
+            </w:r>
+          </w:p>
+        </w:tc>
+        <w:tc>
+          <w:tcPr>
+            <w:tcW w:type="dxa" w:w="3319"/>
+            <w:tcBorders>
+              <w:top w:val="single" w:color="555555" w:sz="6"/>
+              <w:left w:val="single" w:color="555555" w:sz="6"/>
+              <w:bottom w:val="single" w:color="555555" w:sz="6"/>
+              <w:right w:val="single" w:color="555555" w:sz="6"/>
+            </w:tcBorders>
+            <w:tcMar>
+              <w:top w:type="dxa" w:w="40"/>
+              <w:left w:type="dxa" w:w="80"/>
+              <w:bottom w:type="dxa" w:w="40"/>
+              <w:right w:type="dxa" w:w="80"/>
+            </w:tcMar>
+            <w:vAlign w:val="center"/>
+          </w:tcPr>
+          <w:p>
+            <w:pPr>
+              <w:spacing w:after="60" w:before="60" w:line="260"/>
+            </w:pPr>
+            <w:r>
+              <w:rPr>
+                <w:rFonts w:ascii="Arial" w:cs="Arial" w:eastAsia="Arial" w:hAnsi="Arial"/>
+                <w:b w:val="false"/>
+                <w:bCs w:val="false"/>
+                <w:i w:val="false"/>
+                <w:iCs w:val="false"/>
+                <w:sz w:val="18"/>
+                <w:szCs w:val="18"/>
+              </w:rPr>
+              <w:t xml:space="preserve">72128421F</w:t>
+            </w:r>
+          </w:p>
+        </w:tc>
+        <w:tc>
+          <w:tcPr>
+            <w:tcW w:type="dxa" w:w="1500"/>
+            <w:tcBorders>
+              <w:top w:val="single" w:color="555555" w:sz="6"/>
+              <w:left w:val="single" w:color="555555" w:sz="6"/>
+              <w:bottom w:val="single" w:color="555555" w:sz="6"/>
+              <w:right w:val="single" w:color="555555" w:sz="6"/>
+            </w:tcBorders>
+            <w:shd w:fill="E8EEEA" w:color="auto" w:val="clear"/>
+            <w:tcMar>
+              <w:top w:type="dxa" w:w="40"/>
+              <w:left w:type="dxa" w:w="80"/>
+              <w:bottom w:type="dxa" w:w="40"/>
+              <w:right w:type="dxa" w:w="80"/>
+            </w:tcMar>
+            <w:vAlign w:val="center"/>
+          </w:tcPr>
+          <w:p>
+            <w:pPr>
+              <w:spacing w:after="60" w:before="60" w:line="260"/>
+            </w:pPr>
+            <w:r>
+              <w:rPr>
+                <w:rFonts w:ascii="Arial" w:cs="Arial" w:eastAsia="Arial" w:hAnsi="Arial"/>
+                <w:b/>
+                <w:bCs/>
+                <w:i w:val="false"/>
+                <w:iCs w:val="false"/>
+                <w:sz w:val="18"/>
+                <w:szCs w:val="18"/>
+              </w:rPr>
+              <w:t xml:space="preserve">LOCALIDAD</w:t>
+            </w:r>
+          </w:p>
+        </w:tc>
+        <w:tc>
+          <w:tcPr>
+            <w:tcW w:type="dxa" w:w="3319"/>
+            <w:tcBorders>
+              <w:top w:val="single" w:color="555555" w:sz="6"/>
+              <w:left w:val="single" w:color="555555" w:sz="6"/>
+              <w:bottom w:val="single" w:color="555555" w:sz="6"/>
+              <w:right w:val="single" w:color="555555" w:sz="6"/>
+            </w:tcBorders>
+            <w:tcMar>
+              <w:top w:type="dxa" w:w="40"/>
+              <w:left w:type="dxa" w:w="80"/>
+              <w:bottom w:type="dxa" w:w="40"/>
+              <w:right w:type="dxa" w:w="80"/>
+            </w:tcMar>
+            <w:vAlign w:val="center"/>
+          </w:tcPr>
+          <w:p>
+            <w:pPr>
+              <w:spacing w:after="60" w:before="60" w:line="260"/>
+            </w:pPr>
+            <w:r>
+              <w:rPr>
+                <w:rFonts w:ascii="Arial" w:cs="Arial" w:eastAsia="Arial" w:hAnsi="Arial"/>
                 <w:sz w:val="18"/>
                 <w:szCs w:val="18"/>
                 <w:highlight w:val="yellow"/>
@@ -126,6 +341,8 @@
             </w:r>
           </w:p>
         </w:tc>
+      </w:tr>
+      <w:tr>
         <w:tc>
           <w:tcPr>
             <w:tcW w:type="dxa" w:w="1500"/>
@@ -158,13 +375,14 @@
                 <w:sz w:val="18"/>
                 <w:szCs w:val="18"/>
               </w:rPr>
-              <w:t xml:space="preserve">APELLIDOS</w:t>
-            </w:r>
-          </w:p>
-        </w:tc>
-        <w:tc>
-          <w:tcPr>
-            <w:tcW w:type="dxa" w:w="3319"/>
+              <w:t xml:space="preserve">DOMICILIO</w:t>
+            </w:r>
+          </w:p>
+        </w:tc>
+        <w:tc>
+          <w:tcPr>
+            <w:tcW w:type="dxa" w:w="8138"/>
+            <w:gridSpan w:val="3"/>
             <w:tcBorders>
               <w:top w:val="single" w:color="555555" w:sz="6"/>
               <w:left w:val="single" w:color="555555" w:sz="6"/>
@@ -229,7 +447,7 @@
                 <w:sz w:val="18"/>
                 <w:szCs w:val="18"/>
               </w:rPr>
-              <w:t xml:space="preserve">DNI</w:t>
+              <w:t xml:space="preserve">TLF./FAX</w:t>
             </w:r>
           </w:p>
         </w:tc>
@@ -257,12 +475,14 @@
             <w:r>
               <w:rPr>
                 <w:rFonts w:ascii="Arial" w:cs="Arial" w:eastAsia="Arial" w:hAnsi="Arial"/>
-                <w:sz w:val="18"/>
-                <w:szCs w:val="18"/>
-                <w:highlight w:val="yellow"/>
-                <w:highlightCs w:val="yellow"/>
-              </w:rPr>
-              <w:t xml:space="preserve">Pendiente</w:t>
+                <w:b w:val="false"/>
+                <w:bCs w:val="false"/>
+                <w:i w:val="false"/>
+                <w:iCs w:val="false"/>
+                <w:sz w:val="18"/>
+                <w:szCs w:val="18"/>
+              </w:rPr>
+              <w:t xml:space="preserve">679 602 812</w:t>
             </w:r>
           </w:p>
         </w:tc>
@@ -298,7 +518,7 @@
                 <w:sz w:val="18"/>
                 <w:szCs w:val="18"/>
               </w:rPr>
-              <w:t xml:space="preserve">LOCALIDAD</w:t>
+              <w:t xml:space="preserve">CORREO ELECTRÓNICO</w:t>
             </w:r>
           </w:p>
         </w:tc>
@@ -326,224 +546,14 @@
             <w:r>
               <w:rPr>
                 <w:rFonts w:ascii="Arial" w:cs="Arial" w:eastAsia="Arial" w:hAnsi="Arial"/>
-                <w:sz w:val="18"/>
-                <w:szCs w:val="18"/>
-                <w:highlight w:val="yellow"/>
-                <w:highlightCs w:val="yellow"/>
-              </w:rPr>
-              <w:t xml:space="preserve">Pendiente</w:t>
-            </w:r>
-          </w:p>
-        </w:tc>
-      </w:tr>
-      <w:tr>
-        <w:tc>
-          <w:tcPr>
-            <w:tcW w:type="dxa" w:w="1500"/>
-            <w:tcBorders>
-              <w:top w:val="single" w:color="555555" w:sz="6"/>
-              <w:left w:val="single" w:color="555555" w:sz="6"/>
-              <w:bottom w:val="single" w:color="555555" w:sz="6"/>
-              <w:right w:val="single" w:color="555555" w:sz="6"/>
-            </w:tcBorders>
-            <w:shd w:fill="E8EEEA" w:color="auto" w:val="clear"/>
-            <w:tcMar>
-              <w:top w:type="dxa" w:w="40"/>
-              <w:left w:type="dxa" w:w="80"/>
-              <w:bottom w:type="dxa" w:w="40"/>
-              <w:right w:type="dxa" w:w="80"/>
-            </w:tcMar>
-            <w:vAlign w:val="center"/>
-          </w:tcPr>
-          <w:p>
-            <w:pPr>
-              <w:spacing w:after="60" w:before="60" w:line="260"/>
-            </w:pPr>
-            <w:r>
-              <w:rPr>
-                <w:rFonts w:ascii="Arial" w:cs="Arial" w:eastAsia="Arial" w:hAnsi="Arial"/>
-                <w:b/>
-                <w:bCs/>
-                <w:i w:val="false"/>
-                <w:iCs w:val="false"/>
-                <w:sz w:val="18"/>
-                <w:szCs w:val="18"/>
-              </w:rPr>
-              <w:t xml:space="preserve">DOMICILIO</w:t>
-            </w:r>
-          </w:p>
-        </w:tc>
-        <w:tc>
-          <w:tcPr>
-            <w:tcW w:type="dxa" w:w="8138"/>
-            <w:gridSpan w:val="3"/>
-            <w:tcBorders>
-              <w:top w:val="single" w:color="555555" w:sz="6"/>
-              <w:left w:val="single" w:color="555555" w:sz="6"/>
-              <w:bottom w:val="single" w:color="555555" w:sz="6"/>
-              <w:right w:val="single" w:color="555555" w:sz="6"/>
-            </w:tcBorders>
-            <w:tcMar>
-              <w:top w:type="dxa" w:w="40"/>
-              <w:left w:type="dxa" w:w="80"/>
-              <w:bottom w:type="dxa" w:w="40"/>
-              <w:right w:type="dxa" w:w="80"/>
-            </w:tcMar>
-            <w:vAlign w:val="center"/>
-          </w:tcPr>
-          <w:p>
-            <w:pPr>
-              <w:spacing w:after="60" w:before="60" w:line="260"/>
-            </w:pPr>
-            <w:r>
-              <w:rPr>
-                <w:rFonts w:ascii="Arial" w:cs="Arial" w:eastAsia="Arial" w:hAnsi="Arial"/>
-                <w:sz w:val="18"/>
-                <w:szCs w:val="18"/>
-                <w:highlight w:val="yellow"/>
-                <w:highlightCs w:val="yellow"/>
-              </w:rPr>
-              <w:t xml:space="preserve">Pendiente</w:t>
-            </w:r>
-          </w:p>
-        </w:tc>
-      </w:tr>
-      <w:tr>
-        <w:tc>
-          <w:tcPr>
-            <w:tcW w:type="dxa" w:w="1500"/>
-            <w:tcBorders>
-              <w:top w:val="single" w:color="555555" w:sz="6"/>
-              <w:left w:val="single" w:color="555555" w:sz="6"/>
-              <w:bottom w:val="single" w:color="555555" w:sz="6"/>
-              <w:right w:val="single" w:color="555555" w:sz="6"/>
-            </w:tcBorders>
-            <w:shd w:fill="E8EEEA" w:color="auto" w:val="clear"/>
-            <w:tcMar>
-              <w:top w:type="dxa" w:w="40"/>
-              <w:left w:type="dxa" w:w="80"/>
-              <w:bottom w:type="dxa" w:w="40"/>
-              <w:right w:type="dxa" w:w="80"/>
-            </w:tcMar>
-            <w:vAlign w:val="center"/>
-          </w:tcPr>
-          <w:p>
-            <w:pPr>
-              <w:spacing w:after="60" w:before="60" w:line="260"/>
-            </w:pPr>
-            <w:r>
-              <w:rPr>
-                <w:rFonts w:ascii="Arial" w:cs="Arial" w:eastAsia="Arial" w:hAnsi="Arial"/>
-                <w:b/>
-                <w:bCs/>
-                <w:i w:val="false"/>
-                <w:iCs w:val="false"/>
-                <w:sz w:val="18"/>
-                <w:szCs w:val="18"/>
-              </w:rPr>
-              <w:t xml:space="preserve">TLF./FAX</w:t>
-            </w:r>
-          </w:p>
-        </w:tc>
-        <w:tc>
-          <w:tcPr>
-            <w:tcW w:type="dxa" w:w="3319"/>
-            <w:tcBorders>
-              <w:top w:val="single" w:color="555555" w:sz="6"/>
-              <w:left w:val="single" w:color="555555" w:sz="6"/>
-              <w:bottom w:val="single" w:color="555555" w:sz="6"/>
-              <w:right w:val="single" w:color="555555" w:sz="6"/>
-            </w:tcBorders>
-            <w:tcMar>
-              <w:top w:type="dxa" w:w="40"/>
-              <w:left w:type="dxa" w:w="80"/>
-              <w:bottom w:type="dxa" w:w="40"/>
-              <w:right w:type="dxa" w:w="80"/>
-            </w:tcMar>
-            <w:vAlign w:val="center"/>
-          </w:tcPr>
-          <w:p>
-            <w:pPr>
-              <w:spacing w:after="60" w:before="60" w:line="260"/>
-            </w:pPr>
-            <w:r>
-              <w:rPr>
-                <w:rFonts w:ascii="Arial" w:cs="Arial" w:eastAsia="Arial" w:hAnsi="Arial"/>
-                <w:sz w:val="18"/>
-                <w:szCs w:val="18"/>
-                <w:highlight w:val="yellow"/>
-                <w:highlightCs w:val="yellow"/>
-              </w:rPr>
-              <w:t xml:space="preserve">Pendiente</w:t>
-            </w:r>
-          </w:p>
-        </w:tc>
-        <w:tc>
-          <w:tcPr>
-            <w:tcW w:type="dxa" w:w="1500"/>
-            <w:tcBorders>
-              <w:top w:val="single" w:color="555555" w:sz="6"/>
-              <w:left w:val="single" w:color="555555" w:sz="6"/>
-              <w:bottom w:val="single" w:color="555555" w:sz="6"/>
-              <w:right w:val="single" w:color="555555" w:sz="6"/>
-            </w:tcBorders>
-            <w:shd w:fill="E8EEEA" w:color="auto" w:val="clear"/>
-            <w:tcMar>
-              <w:top w:type="dxa" w:w="40"/>
-              <w:left w:type="dxa" w:w="80"/>
-              <w:bottom w:type="dxa" w:w="40"/>
-              <w:right w:type="dxa" w:w="80"/>
-            </w:tcMar>
-            <w:vAlign w:val="center"/>
-          </w:tcPr>
-          <w:p>
-            <w:pPr>
-              <w:spacing w:after="60" w:before="60" w:line="260"/>
-            </w:pPr>
-            <w:r>
-              <w:rPr>
-                <w:rFonts w:ascii="Arial" w:cs="Arial" w:eastAsia="Arial" w:hAnsi="Arial"/>
-                <w:b/>
-                <w:bCs/>
-                <w:i w:val="false"/>
-                <w:iCs w:val="false"/>
-                <w:sz w:val="18"/>
-                <w:szCs w:val="18"/>
-              </w:rPr>
-              <w:t xml:space="preserve">CORREO ELECTRÓNICO</w:t>
-            </w:r>
-          </w:p>
-        </w:tc>
-        <w:tc>
-          <w:tcPr>
-            <w:tcW w:type="dxa" w:w="3319"/>
-            <w:tcBorders>
-              <w:top w:val="single" w:color="555555" w:sz="6"/>
-              <w:left w:val="single" w:color="555555" w:sz="6"/>
-              <w:bottom w:val="single" w:color="555555" w:sz="6"/>
-              <w:right w:val="single" w:color="555555" w:sz="6"/>
-            </w:tcBorders>
-            <w:tcMar>
-              <w:top w:type="dxa" w:w="40"/>
-              <w:left w:type="dxa" w:w="80"/>
-              <w:bottom w:type="dxa" w:w="40"/>
-              <w:right w:type="dxa" w:w="80"/>
-            </w:tcMar>
-            <w:vAlign w:val="center"/>
-          </w:tcPr>
-          <w:p>
-            <w:pPr>
-              <w:spacing w:after="60" w:before="60" w:line="260"/>
-            </w:pPr>
-            <w:r>
-              <w:rPr>
-                <w:rFonts w:ascii="Arial" w:cs="Arial" w:eastAsia="Arial" w:hAnsi="Arial"/>
-                <w:sz w:val="18"/>
-                <w:szCs w:val="18"/>
-                <w:highlight w:val="yellow"/>
-                <w:highlightCs w:val="yellow"/>
-              </w:rPr>
-              <w:t xml:space="preserve">Pendiente</w:t>
+                <w:b w:val="false"/>
+                <w:bCs w:val="false"/>
+                <w:i w:val="false"/>
+                <w:iCs w:val="false"/>
+                <w:sz w:val="18"/>
+                <w:szCs w:val="18"/>
+              </w:rPr>
+              <w:t xml:space="preserve">Kmverticaltorrelavega@gmail.com</w:t>
             </w:r>
           </w:p>
         </w:tc>
@@ -735,7 +745,7 @@
                 <w:sz w:val="18"/>
                 <w:szCs w:val="18"/>
               </w:rPr>
-              <w:t xml:space="preserve">Club Deportivo Elemental Kilómetro Vertical de Torrelavega</w:t>
+              <w:t xml:space="preserve">Club Deportivo Elemental KM Vertical Torrelavega</w:t>
             </w:r>
           </w:p>
         </w:tc>
@@ -801,12 +811,14 @@
             <w:r>
               <w:rPr>
                 <w:rFonts w:ascii="Arial" w:cs="Arial" w:eastAsia="Arial" w:hAnsi="Arial"/>
-                <w:sz w:val="18"/>
-                <w:szCs w:val="18"/>
-                <w:highlight w:val="yellow"/>
-                <w:highlightCs w:val="yellow"/>
-              </w:rPr>
-              <w:t xml:space="preserve">Pendiente</w:t>
+                <w:b w:val="false"/>
+                <w:bCs w:val="false"/>
+                <w:i w:val="false"/>
+                <w:iCs w:val="false"/>
+                <w:sz w:val="18"/>
+                <w:szCs w:val="18"/>
+              </w:rPr>
+              <w:t xml:space="preserve">G39861828</w:t>
             </w:r>
           </w:p>
         </w:tc>
@@ -1526,7 +1538,7 @@
                 <w:sz w:val="18"/>
                 <w:szCs w:val="18"/>
               </w:rPr>
-              <w:t xml:space="preserve">Organizan: Club Deportivo Elemental Kilómetro Vertical de Torrelavega y Grupo de Montaña Tejas4run, en colaboración con el Ayuntamiento de San Felices de Buelna. Se adjuntan el reglamento de la prueba y el trazado del recorrido.</w:t>
+              <w:t xml:space="preserve">Organizan: Club Deportivo Elemental KM Vertical Torrelavega y Grupo de Montaña Tejas4run, en colaboración con el Ayuntamiento de San Felices de Buelna. Se adjuntan el reglamento de la prueba y el trazado del recorrido.</w:t>
             </w:r>
           </w:p>
         </w:tc>
@@ -3827,7 +3839,7 @@
                 <w:sz w:val="24"/>
                 <w:szCs w:val="24"/>
               </w:rPr>
-              <w:t xml:space="preserve">☐</w:t>
+              <w:t xml:space="preserve">☒</w:t>
             </w:r>
           </w:p>
         </w:tc>
@@ -3862,7 +3874,17 @@
                 <w:sz w:val="18"/>
                 <w:szCs w:val="18"/>
               </w:rPr>
-              <w:t xml:space="preserve">PLAN DE AUTOPROTECCIÓN</w:t>
+              <w:t xml:space="preserve">PLAN DE AUTOPROTECCIÓN </w:t>
+            </w:r>
+            <w:r>
+              <w:rPr>
+                <w:rFonts w:ascii="Arial" w:cs="Arial" w:eastAsia="Arial" w:hAnsi="Arial"/>
+                <w:sz w:val="18"/>
+                <w:szCs w:val="18"/>
+                <w:highlight w:val="yellow"/>
+                <w:highlightCs w:val="yellow"/>
+              </w:rPr>
+              <w:t xml:space="preserve">(actualizar el de 2025 a la edición de 2026)</w:t>
             </w:r>
           </w:p>
         </w:tc>
@@ -3940,198 +3962,283 @@
             <w:r>
               <w:rPr>
                 <w:rFonts w:ascii="Arial" w:cs="Arial" w:eastAsia="Arial" w:hAnsi="Arial"/>
+                <w:b w:val="false"/>
+                <w:bCs w:val="false"/>
+                <w:i w:val="false"/>
+                <w:iCs w:val="false"/>
+                <w:sz w:val="18"/>
+                <w:szCs w:val="18"/>
+              </w:rPr>
+              <w:t xml:space="preserve">(incluido en el plan de autoprotección)</w:t>
+            </w:r>
+          </w:p>
+        </w:tc>
+      </w:tr>
+      <w:tr>
+        <w:tc>
+          <w:tcPr>
+            <w:tcW w:type="dxa" w:w="9638"/>
+            <w:gridSpan w:val="2"/>
+            <w:tcBorders>
+              <w:top w:val="single" w:color="555555" w:sz="6"/>
+              <w:left w:val="single" w:color="555555" w:sz="6"/>
+              <w:bottom w:val="single" w:color="555555" w:sz="6"/>
+              <w:right w:val="single" w:color="555555" w:sz="6"/>
+            </w:tcBorders>
+            <w:shd w:fill="E8EEEA" w:color="auto" w:val="clear"/>
+            <w:tcMar>
+              <w:top w:type="dxa" w:w="40"/>
+              <w:left w:type="dxa" w:w="80"/>
+              <w:bottom w:type="dxa" w:w="40"/>
+              <w:right w:type="dxa" w:w="80"/>
+            </w:tcMar>
+            <w:vAlign w:val="center"/>
+          </w:tcPr>
+          <w:p>
+            <w:pPr>
+              <w:spacing w:after="60" w:before="60" w:line="260"/>
+              <w:jc w:val="center"/>
+            </w:pPr>
+            <w:r>
+              <w:rPr>
+                <w:rFonts w:ascii="Arial" w:cs="Arial" w:eastAsia="Arial" w:hAnsi="Arial"/>
+                <w:b/>
+                <w:bCs/>
+                <w:i w:val="false"/>
+                <w:iCs w:val="false"/>
+                <w:sz w:val="18"/>
+                <w:szCs w:val="18"/>
+              </w:rPr>
+              <w:t xml:space="preserve">OTRA DOCUMENTACIÓN TÉCNICA:</w:t>
+            </w:r>
+          </w:p>
+        </w:tc>
+      </w:tr>
+      <w:tr>
+        <w:tc>
+          <w:tcPr>
+            <w:tcW w:type="dxa" w:w="700"/>
+            <w:tcBorders>
+              <w:top w:val="single" w:color="555555" w:sz="6"/>
+              <w:left w:val="single" w:color="555555" w:sz="6"/>
+              <w:bottom w:val="single" w:color="555555" w:sz="6"/>
+              <w:right w:val="single" w:color="555555" w:sz="6"/>
+            </w:tcBorders>
+            <w:tcMar>
+              <w:top w:type="dxa" w:w="40"/>
+              <w:left w:type="dxa" w:w="80"/>
+              <w:bottom w:type="dxa" w:w="40"/>
+              <w:right w:type="dxa" w:w="80"/>
+            </w:tcMar>
+            <w:vAlign w:val="center"/>
+          </w:tcPr>
+          <w:p>
+            <w:pPr>
+              <w:spacing w:after="60" w:before="60" w:line="260"/>
+              <w:jc w:val="center"/>
+            </w:pPr>
+            <w:r>
+              <w:rPr>
+                <w:rFonts w:ascii="Arial" w:cs="Arial" w:eastAsia="Arial" w:hAnsi="Arial"/>
+                <w:b w:val="false"/>
+                <w:bCs w:val="false"/>
+                <w:i w:val="false"/>
+                <w:iCs w:val="false"/>
+                <w:sz w:val="24"/>
+                <w:szCs w:val="24"/>
+              </w:rPr>
+              <w:t xml:space="preserve">☒</w:t>
+            </w:r>
+          </w:p>
+        </w:tc>
+        <w:tc>
+          <w:tcPr>
+            <w:tcW w:type="dxa" w:w="8938"/>
+            <w:tcBorders>
+              <w:top w:val="single" w:color="555555" w:sz="6"/>
+              <w:left w:val="single" w:color="555555" w:sz="6"/>
+              <w:bottom w:val="single" w:color="555555" w:sz="6"/>
+              <w:right w:val="single" w:color="555555" w:sz="6"/>
+            </w:tcBorders>
+            <w:tcMar>
+              <w:top w:type="dxa" w:w="40"/>
+              <w:left w:type="dxa" w:w="80"/>
+              <w:bottom w:type="dxa" w:w="40"/>
+              <w:right w:type="dxa" w:w="80"/>
+            </w:tcMar>
+            <w:vAlign w:val="center"/>
+          </w:tcPr>
+          <w:p>
+            <w:pPr>
+              <w:spacing w:after="60" w:before="60" w:line="260"/>
+            </w:pPr>
+            <w:r>
+              <w:rPr>
+                <w:rFonts w:ascii="Arial" w:cs="Arial" w:eastAsia="Arial" w:hAnsi="Arial"/>
+                <w:b/>
+                <w:bCs/>
+                <w:i w:val="false"/>
+                <w:iCs w:val="false"/>
+                <w:sz w:val="18"/>
+                <w:szCs w:val="18"/>
+              </w:rPr>
+              <w:t xml:space="preserve">TRAZADO/CIRCUITO DE PRUEBAS DEPORTIVAS, MARCHAS, ETC. (se adjunta el trazado del recorrido con plano, perfil, puntos de paso y horarios, y el reglamento de la prueba)</w:t>
+            </w:r>
+          </w:p>
+        </w:tc>
+      </w:tr>
+      <w:tr>
+        <w:tc>
+          <w:tcPr>
+            <w:tcW w:type="dxa" w:w="700"/>
+            <w:tcBorders>
+              <w:top w:val="single" w:color="555555" w:sz="6"/>
+              <w:left w:val="single" w:color="555555" w:sz="6"/>
+              <w:bottom w:val="single" w:color="555555" w:sz="6"/>
+              <w:right w:val="single" w:color="555555" w:sz="6"/>
+            </w:tcBorders>
+            <w:tcMar>
+              <w:top w:type="dxa" w:w="40"/>
+              <w:left w:type="dxa" w:w="80"/>
+              <w:bottom w:type="dxa" w:w="40"/>
+              <w:right w:type="dxa" w:w="80"/>
+            </w:tcMar>
+            <w:vAlign w:val="center"/>
+          </w:tcPr>
+          <w:p>
+            <w:pPr>
+              <w:spacing w:after="60" w:before="60" w:line="260"/>
+              <w:jc w:val="center"/>
+            </w:pPr>
+            <w:r>
+              <w:rPr>
+                <w:rFonts w:ascii="Arial" w:cs="Arial" w:eastAsia="Arial" w:hAnsi="Arial"/>
+                <w:b w:val="false"/>
+                <w:bCs w:val="false"/>
+                <w:i w:val="false"/>
+                <w:iCs w:val="false"/>
+                <w:sz w:val="24"/>
+                <w:szCs w:val="24"/>
+              </w:rPr>
+              <w:t xml:space="preserve">☐</w:t>
+            </w:r>
+          </w:p>
+        </w:tc>
+        <w:tc>
+          <w:tcPr>
+            <w:tcW w:type="dxa" w:w="8938"/>
+            <w:tcBorders>
+              <w:top w:val="single" w:color="555555" w:sz="6"/>
+              <w:left w:val="single" w:color="555555" w:sz="6"/>
+              <w:bottom w:val="single" w:color="555555" w:sz="6"/>
+              <w:right w:val="single" w:color="555555" w:sz="6"/>
+            </w:tcBorders>
+            <w:tcMar>
+              <w:top w:type="dxa" w:w="40"/>
+              <w:left w:type="dxa" w:w="80"/>
+              <w:bottom w:type="dxa" w:w="40"/>
+              <w:right w:type="dxa" w:w="80"/>
+            </w:tcMar>
+            <w:vAlign w:val="center"/>
+          </w:tcPr>
+          <w:p>
+            <w:pPr>
+              <w:spacing w:after="60" w:before="60" w:line="260"/>
+            </w:pPr>
+            <w:r>
+              <w:rPr>
+                <w:rFonts w:ascii="Arial" w:cs="Arial" w:eastAsia="Arial" w:hAnsi="Arial"/>
+                <w:b/>
+                <w:bCs/>
+                <w:i w:val="false"/>
+                <w:iCs w:val="false"/>
+                <w:sz w:val="18"/>
+                <w:szCs w:val="18"/>
+              </w:rPr>
+              <w:t xml:space="preserve">PROYECTO DE MONTAJE Y DESMONTAJE</w:t>
+            </w:r>
+          </w:p>
+        </w:tc>
+      </w:tr>
+      <w:tr>
+        <w:tc>
+          <w:tcPr>
+            <w:tcW w:type="dxa" w:w="700"/>
+            <w:tcBorders>
+              <w:top w:val="single" w:color="555555" w:sz="6"/>
+              <w:left w:val="single" w:color="555555" w:sz="6"/>
+              <w:bottom w:val="single" w:color="555555" w:sz="6"/>
+              <w:right w:val="single" w:color="555555" w:sz="6"/>
+            </w:tcBorders>
+            <w:tcMar>
+              <w:top w:type="dxa" w:w="40"/>
+              <w:left w:type="dxa" w:w="80"/>
+              <w:bottom w:type="dxa" w:w="40"/>
+              <w:right w:type="dxa" w:w="80"/>
+            </w:tcMar>
+            <w:vAlign w:val="center"/>
+          </w:tcPr>
+          <w:p>
+            <w:pPr>
+              <w:spacing w:after="60" w:before="60" w:line="260"/>
+              <w:jc w:val="center"/>
+            </w:pPr>
+            <w:r>
+              <w:rPr>
+                <w:rFonts w:ascii="Arial" w:cs="Arial" w:eastAsia="Arial" w:hAnsi="Arial"/>
+                <w:b w:val="false"/>
+                <w:bCs w:val="false"/>
+                <w:i w:val="false"/>
+                <w:iCs w:val="false"/>
+                <w:sz w:val="24"/>
+                <w:szCs w:val="24"/>
+              </w:rPr>
+              <w:t xml:space="preserve">☒</w:t>
+            </w:r>
+          </w:p>
+        </w:tc>
+        <w:tc>
+          <w:tcPr>
+            <w:tcW w:type="dxa" w:w="8938"/>
+            <w:tcBorders>
+              <w:top w:val="single" w:color="555555" w:sz="6"/>
+              <w:left w:val="single" w:color="555555" w:sz="6"/>
+              <w:bottom w:val="single" w:color="555555" w:sz="6"/>
+              <w:right w:val="single" w:color="555555" w:sz="6"/>
+            </w:tcBorders>
+            <w:tcMar>
+              <w:top w:type="dxa" w:w="40"/>
+              <w:left w:type="dxa" w:w="80"/>
+              <w:bottom w:type="dxa" w:w="40"/>
+              <w:right w:type="dxa" w:w="80"/>
+            </w:tcMar>
+            <w:vAlign w:val="center"/>
+          </w:tcPr>
+          <w:p>
+            <w:pPr>
+              <w:spacing w:after="60" w:before="60" w:line="260"/>
+            </w:pPr>
+            <w:r>
+              <w:rPr>
+                <w:rFonts w:ascii="Arial" w:cs="Arial" w:eastAsia="Arial" w:hAnsi="Arial"/>
+                <w:b/>
+                <w:bCs/>
+                <w:i w:val="false"/>
+                <w:iCs w:val="false"/>
+                <w:sz w:val="18"/>
+                <w:szCs w:val="18"/>
+              </w:rPr>
+              <w:t xml:space="preserve">CERTIFICADOS DE REVISIÓN DE LA CARPA Y DEL ARCO PUBLICITARIO (SCOTT) </w:t>
+            </w:r>
+            <w:r>
+              <w:rPr>
+                <w:rFonts w:ascii="Arial" w:cs="Arial" w:eastAsia="Arial" w:hAnsi="Arial"/>
                 <w:sz w:val="18"/>
                 <w:szCs w:val="18"/>
                 <w:highlight w:val="yellow"/>
                 <w:highlightCs w:val="yellow"/>
               </w:rPr>
-              <w:t xml:space="preserve">(pendiente de redactar: plan de seguridad y emergencias)</w:t>
-            </w:r>
-          </w:p>
-        </w:tc>
-      </w:tr>
-      <w:tr>
-        <w:tc>
-          <w:tcPr>
-            <w:tcW w:type="dxa" w:w="9638"/>
-            <w:gridSpan w:val="2"/>
-            <w:tcBorders>
-              <w:top w:val="single" w:color="555555" w:sz="6"/>
-              <w:left w:val="single" w:color="555555" w:sz="6"/>
-              <w:bottom w:val="single" w:color="555555" w:sz="6"/>
-              <w:right w:val="single" w:color="555555" w:sz="6"/>
-            </w:tcBorders>
-            <w:shd w:fill="E8EEEA" w:color="auto" w:val="clear"/>
-            <w:tcMar>
-              <w:top w:type="dxa" w:w="40"/>
-              <w:left w:type="dxa" w:w="80"/>
-              <w:bottom w:type="dxa" w:w="40"/>
-              <w:right w:type="dxa" w:w="80"/>
-            </w:tcMar>
-            <w:vAlign w:val="center"/>
-          </w:tcPr>
-          <w:p>
-            <w:pPr>
-              <w:spacing w:after="60" w:before="60" w:line="260"/>
-              <w:jc w:val="center"/>
-            </w:pPr>
-            <w:r>
-              <w:rPr>
-                <w:rFonts w:ascii="Arial" w:cs="Arial" w:eastAsia="Arial" w:hAnsi="Arial"/>
-                <w:b/>
-                <w:bCs/>
-                <w:i w:val="false"/>
-                <w:iCs w:val="false"/>
-                <w:sz w:val="18"/>
-                <w:szCs w:val="18"/>
-              </w:rPr>
-              <w:t xml:space="preserve">OTRA DOCUMENTACIÓN TÉCNICA:</w:t>
-            </w:r>
-          </w:p>
-        </w:tc>
-      </w:tr>
-      <w:tr>
-        <w:tc>
-          <w:tcPr>
-            <w:tcW w:type="dxa" w:w="700"/>
-            <w:tcBorders>
-              <w:top w:val="single" w:color="555555" w:sz="6"/>
-              <w:left w:val="single" w:color="555555" w:sz="6"/>
-              <w:bottom w:val="single" w:color="555555" w:sz="6"/>
-              <w:right w:val="single" w:color="555555" w:sz="6"/>
-            </w:tcBorders>
-            <w:tcMar>
-              <w:top w:type="dxa" w:w="40"/>
-              <w:left w:type="dxa" w:w="80"/>
-              <w:bottom w:type="dxa" w:w="40"/>
-              <w:right w:type="dxa" w:w="80"/>
-            </w:tcMar>
-            <w:vAlign w:val="center"/>
-          </w:tcPr>
-          <w:p>
-            <w:pPr>
-              <w:spacing w:after="60" w:before="60" w:line="260"/>
-              <w:jc w:val="center"/>
-            </w:pPr>
-            <w:r>
-              <w:rPr>
-                <w:rFonts w:ascii="Arial" w:cs="Arial" w:eastAsia="Arial" w:hAnsi="Arial"/>
-                <w:b w:val="false"/>
-                <w:bCs w:val="false"/>
-                <w:i w:val="false"/>
-                <w:iCs w:val="false"/>
-                <w:sz w:val="24"/>
-                <w:szCs w:val="24"/>
-              </w:rPr>
-              <w:t xml:space="preserve">☒</w:t>
-            </w:r>
-          </w:p>
-        </w:tc>
-        <w:tc>
-          <w:tcPr>
-            <w:tcW w:type="dxa" w:w="8938"/>
-            <w:tcBorders>
-              <w:top w:val="single" w:color="555555" w:sz="6"/>
-              <w:left w:val="single" w:color="555555" w:sz="6"/>
-              <w:bottom w:val="single" w:color="555555" w:sz="6"/>
-              <w:right w:val="single" w:color="555555" w:sz="6"/>
-            </w:tcBorders>
-            <w:tcMar>
-              <w:top w:type="dxa" w:w="40"/>
-              <w:left w:type="dxa" w:w="80"/>
-              <w:bottom w:type="dxa" w:w="40"/>
-              <w:right w:type="dxa" w:w="80"/>
-            </w:tcMar>
-            <w:vAlign w:val="center"/>
-          </w:tcPr>
-          <w:p>
-            <w:pPr>
-              <w:spacing w:after="60" w:before="60" w:line="260"/>
-            </w:pPr>
-            <w:r>
-              <w:rPr>
-                <w:rFonts w:ascii="Arial" w:cs="Arial" w:eastAsia="Arial" w:hAnsi="Arial"/>
-                <w:b/>
-                <w:bCs/>
-                <w:i w:val="false"/>
-                <w:iCs w:val="false"/>
-                <w:sz w:val="18"/>
-                <w:szCs w:val="18"/>
-              </w:rPr>
-              <w:t xml:space="preserve">TRAZADO/CIRCUITO DE PRUEBAS DEPORTIVAS, MARCHAS, ETC. (se adjunta el trazado del recorrido con plano, perfil, puntos de paso y horarios, y el reglamento de la prueba)</w:t>
-            </w:r>
-          </w:p>
-        </w:tc>
-      </w:tr>
-      <w:tr>
-        <w:tc>
-          <w:tcPr>
-            <w:tcW w:type="dxa" w:w="700"/>
-            <w:tcBorders>
-              <w:top w:val="single" w:color="555555" w:sz="6"/>
-              <w:left w:val="single" w:color="555555" w:sz="6"/>
-              <w:bottom w:val="single" w:color="555555" w:sz="6"/>
-              <w:right w:val="single" w:color="555555" w:sz="6"/>
-            </w:tcBorders>
-            <w:tcMar>
-              <w:top w:type="dxa" w:w="40"/>
-              <w:left w:type="dxa" w:w="80"/>
-              <w:bottom w:type="dxa" w:w="40"/>
-              <w:right w:type="dxa" w:w="80"/>
-            </w:tcMar>
-            <w:vAlign w:val="center"/>
-          </w:tcPr>
-          <w:p>
-            <w:pPr>
-              <w:spacing w:after="60" w:before="60" w:line="260"/>
-              <w:jc w:val="center"/>
-            </w:pPr>
-            <w:r>
-              <w:rPr>
-                <w:rFonts w:ascii="Arial" w:cs="Arial" w:eastAsia="Arial" w:hAnsi="Arial"/>
-                <w:b w:val="false"/>
-                <w:bCs w:val="false"/>
-                <w:i w:val="false"/>
-                <w:iCs w:val="false"/>
-                <w:sz w:val="24"/>
-                <w:szCs w:val="24"/>
-              </w:rPr>
-              <w:t xml:space="preserve">☐</w:t>
-            </w:r>
-          </w:p>
-        </w:tc>
-        <w:tc>
-          <w:tcPr>
-            <w:tcW w:type="dxa" w:w="8938"/>
-            <w:tcBorders>
-              <w:top w:val="single" w:color="555555" w:sz="6"/>
-              <w:left w:val="single" w:color="555555" w:sz="6"/>
-              <w:bottom w:val="single" w:color="555555" w:sz="6"/>
-              <w:right w:val="single" w:color="555555" w:sz="6"/>
-            </w:tcBorders>
-            <w:tcMar>
-              <w:top w:type="dxa" w:w="40"/>
-              <w:left w:type="dxa" w:w="80"/>
-              <w:bottom w:type="dxa" w:w="40"/>
-              <w:right w:type="dxa" w:w="80"/>
-            </w:tcMar>
-            <w:vAlign w:val="center"/>
-          </w:tcPr>
-          <w:p>
-            <w:pPr>
-              <w:spacing w:after="60" w:before="60" w:line="260"/>
-            </w:pPr>
-            <w:r>
-              <w:rPr>
-                <w:rFonts w:ascii="Arial" w:cs="Arial" w:eastAsia="Arial" w:hAnsi="Arial"/>
-                <w:b/>
-                <w:bCs/>
-                <w:i w:val="false"/>
-                <w:iCs w:val="false"/>
-                <w:sz w:val="18"/>
-                <w:szCs w:val="18"/>
-              </w:rPr>
-              <w:t xml:space="preserve">PROYECTO DE MONTAJE Y DESMONTAJE</w:t>
+              <w:t xml:space="preserve">(los de 2025 o los renovados para 2026)</w:t>
             </w:r>
           </w:p>
         </w:tc>
@@ -4229,29 +4336,7 @@
           <w:sz w:val="18"/>
           <w:szCs w:val="18"/>
         </w:rPr>
-        <w:t xml:space="preserve">Fdo.: </w:t>
-      </w:r>
-      <w:r>
-        <w:rPr>
-          <w:rFonts w:ascii="Arial" w:cs="Arial" w:eastAsia="Arial" w:hAnsi="Arial"/>
-          <w:sz w:val="18"/>
-          <w:szCs w:val="18"/>
-          <w:highlight w:val="yellow"/>
-          <w:highlightCs w:val="yellow"/>
-        </w:rPr>
-        <w:t xml:space="preserve">Nombre y apellidos del representante</w:t>
-      </w:r>
-      <w:r>
-        <w:rPr>
-          <w:rFonts w:ascii="Arial" w:cs="Arial" w:eastAsia="Arial" w:hAnsi="Arial"/>
-          <w:b w:val="false"/>
-          <w:bCs w:val="false"/>
-          <w:i w:val="false"/>
-          <w:iCs w:val="false"/>
-          <w:sz w:val="18"/>
-          <w:szCs w:val="18"/>
-        </w:rPr>
-        <w:t xml:space="preserve">, en representación de Club Deportivo Elemental Kilómetro Vertical de Torrelavega.</w:t>
+        <w:t xml:space="preserve">Fdo.: Jonatan Corona Miguel, en representación de Club Deportivo Elemental KM Vertical Torrelavega.</w:t>
       </w:r>
     </w:p>
     <w:p>

</xml_diff>